<commit_message>
Reject duplicate member ID when admin adds a member
</commit_message>
<xml_diff>
--- a/docs/Task Assignment & Tool Usage Evidence.docx
+++ b/docs/Task Assignment & Tool Usage Evidence.docx
@@ -78,12 +78,6 @@
         <w:gridCol w:w="1191"/>
       </w:tblGrid>
       <w:tr>
-        <w:tblPrEx>
-          <w:tblCellMar>
-            <w:top w:w="0" w:type="dxa"/>
-            <w:bottom w:w="0" w:type="dxa"/>
-          </w:tblCellMar>
-        </w:tblPrEx>
         <w:trPr>
           <w:cantSplit/>
         </w:trPr>
@@ -215,12 +209,6 @@
         </w:tc>
       </w:tr>
       <w:tr>
-        <w:tblPrEx>
-          <w:tblCellMar>
-            <w:top w:w="0" w:type="dxa"/>
-            <w:bottom w:w="0" w:type="dxa"/>
-          </w:tblCellMar>
-        </w:tblPrEx>
         <w:trPr>
           <w:cantSplit/>
         </w:trPr>
@@ -310,12 +298,6 @@
         </w:tc>
       </w:tr>
       <w:tr>
-        <w:tblPrEx>
-          <w:tblCellMar>
-            <w:top w:w="0" w:type="dxa"/>
-            <w:bottom w:w="0" w:type="dxa"/>
-          </w:tblCellMar>
-        </w:tblPrEx>
         <w:trPr>
           <w:cantSplit/>
         </w:trPr>
@@ -405,12 +387,6 @@
         </w:tc>
       </w:tr>
       <w:tr>
-        <w:tblPrEx>
-          <w:tblCellMar>
-            <w:top w:w="0" w:type="dxa"/>
-            <w:bottom w:w="0" w:type="dxa"/>
-          </w:tblCellMar>
-        </w:tblPrEx>
         <w:trPr>
           <w:cantSplit/>
         </w:trPr>
@@ -500,12 +476,6 @@
         </w:tc>
       </w:tr>
       <w:tr>
-        <w:tblPrEx>
-          <w:tblCellMar>
-            <w:top w:w="0" w:type="dxa"/>
-            <w:bottom w:w="0" w:type="dxa"/>
-          </w:tblCellMar>
-        </w:tblPrEx>
         <w:trPr>
           <w:cantSplit/>
         </w:trPr>
@@ -595,12 +565,6 @@
         </w:tc>
       </w:tr>
       <w:tr>
-        <w:tblPrEx>
-          <w:tblCellMar>
-            <w:top w:w="0" w:type="dxa"/>
-            <w:bottom w:w="0" w:type="dxa"/>
-          </w:tblCellMar>
-        </w:tblPrEx>
         <w:trPr>
           <w:cantSplit/>
         </w:trPr>
@@ -898,7 +862,7 @@
       <w:r>
         <w:drawing>
           <wp:inline distT="0" distB="0" distL="0" distR="0" wp14:anchorId="2804C07C" wp14:editId="59590F44">
-            <wp:extent cx="6096000" cy="3143250"/>
+            <wp:extent cx="6096000" cy="2986457"/>
             <wp:effectExtent l="0" t="0" r="0" b="0"/>
             <wp:docPr id="1330679382" name="Hình ảnh 1330679382"/>
             <wp:cNvGraphicFramePr>
@@ -923,7 +887,7 @@
                   <pic:spPr bwMode="auto">
                     <a:xfrm>
                       <a:off x="0" y="0"/>
-                      <a:ext cx="6096000" cy="3143250"/>
+                      <a:ext cx="6096000" cy="2986457"/>
                     </a:xfrm>
                     <a:prstGeom prst="rect">
                       <a:avLst/>
@@ -981,10 +945,10 @@
       </w:pPr>
       <w:r>
         <w:drawing>
-          <wp:inline distT="0" distB="0" distL="0" distR="0" wp14:anchorId="358EF5A1" wp14:editId="7CEAB5A2">
-            <wp:extent cx="8229600" cy="4307205"/>
-            <wp:effectExtent l="0" t="0" r="0" b="0"/>
-            <wp:docPr id="430361173" name="Hình ảnh 1"/>
+          <wp:inline distT="0" distB="0" distL="0" distR="0" wp14:anchorId="44EE2423" wp14:editId="2E0589BA">
+            <wp:extent cx="8229600" cy="4208145"/>
+            <wp:effectExtent l="0" t="0" r="0" b="1905"/>
+            <wp:docPr id="1797982747" name="Hình ảnh 1"/>
             <wp:cNvGraphicFramePr>
               <a:graphicFrameLocks xmlns:a="http://schemas.openxmlformats.org/drawingml/2006/main" noChangeAspect="1"/>
             </wp:cNvGraphicFramePr>
@@ -992,7 +956,7 @@
               <a:graphicData uri="http://schemas.openxmlformats.org/drawingml/2006/picture">
                 <pic:pic xmlns:pic="http://schemas.openxmlformats.org/drawingml/2006/picture">
                   <pic:nvPicPr>
-                    <pic:cNvPr id="430361173" name=""/>
+                    <pic:cNvPr id="1797982747" name=""/>
                     <pic:cNvPicPr/>
                   </pic:nvPicPr>
                   <pic:blipFill>
@@ -1004,7 +968,7 @@
                   <pic:spPr>
                     <a:xfrm>
                       <a:off x="0" y="0"/>
-                      <a:ext cx="8229600" cy="4307205"/>
+                      <a:ext cx="8229600" cy="4208145"/>
                     </a:xfrm>
                     <a:prstGeom prst="rect">
                       <a:avLst/>
@@ -1021,10 +985,59 @@
       <w:pPr>
         <w:spacing w:after="150"/>
         <w:rPr>
+          <w:rFonts w:ascii="Calibri" w:eastAsia="Calibri" w:hAnsi="Calibri" w:cs="Calibri"/>
+          <w:sz w:val="22"/>
+          <w:szCs w:val="22"/>
           <w:lang w:val="en-US"/>
         </w:rPr>
       </w:pPr>
       <w:r>
+        <w:lastRenderedPageBreak/>
+        <w:drawing>
+          <wp:inline distT="0" distB="0" distL="0" distR="0" wp14:anchorId="66B65355" wp14:editId="6CDD56A1">
+            <wp:extent cx="8229600" cy="4141470"/>
+            <wp:effectExtent l="0" t="0" r="0" b="0"/>
+            <wp:docPr id="65768484" name="Hình ảnh 1"/>
+            <wp:cNvGraphicFramePr>
+              <a:graphicFrameLocks xmlns:a="http://schemas.openxmlformats.org/drawingml/2006/main" noChangeAspect="1"/>
+            </wp:cNvGraphicFramePr>
+            <a:graphic xmlns:a="http://schemas.openxmlformats.org/drawingml/2006/main">
+              <a:graphicData uri="http://schemas.openxmlformats.org/drawingml/2006/picture">
+                <pic:pic xmlns:pic="http://schemas.openxmlformats.org/drawingml/2006/picture">
+                  <pic:nvPicPr>
+                    <pic:cNvPr id="65768484" name=""/>
+                    <pic:cNvPicPr/>
+                  </pic:nvPicPr>
+                  <pic:blipFill>
+                    <a:blip r:embed="rId9"/>
+                    <a:stretch>
+                      <a:fillRect/>
+                    </a:stretch>
+                  </pic:blipFill>
+                  <pic:spPr>
+                    <a:xfrm>
+                      <a:off x="0" y="0"/>
+                      <a:ext cx="8229600" cy="4141470"/>
+                    </a:xfrm>
+                    <a:prstGeom prst="rect">
+                      <a:avLst/>
+                    </a:prstGeom>
+                  </pic:spPr>
+                </pic:pic>
+              </a:graphicData>
+            </a:graphic>
+          </wp:inline>
+        </w:drawing>
+      </w:r>
+    </w:p>
+    <w:p>
+      <w:pPr>
+        <w:spacing w:after="150"/>
+        <w:rPr>
+          <w:lang w:val="en-US"/>
+        </w:rPr>
+      </w:pPr>
+      <w:r>
         <w:rPr>
           <w:rFonts w:ascii="Calibri" w:eastAsia="Calibri" w:hAnsi="Calibri" w:cs="Calibri"/>
           <w:sz w:val="22"/>
@@ -1061,6 +1074,9 @@
     <w:p>
       <w:pPr>
         <w:spacing w:after="60"/>
+        <w:rPr>
+          <w:lang w:val="en-US"/>
+        </w:rPr>
       </w:pPr>
       <w:r>
         <w:rPr>
@@ -1069,7 +1085,7 @@
           <w:szCs w:val="22"/>
         </w:rPr>
         <w:lastRenderedPageBreak/>
-        <w:t>• draw.io (app.diagrams.net) — Data Model &amp; sơ đồ khác</w:t>
+        <w:t>• draw.io (app.diagrams.net)</w:t>
       </w:r>
     </w:p>
     <w:p>
@@ -1095,7 +1111,7 @@
                     </pic:cNvPicPr>
                   </pic:nvPicPr>
                   <pic:blipFill>
-                    <a:blip r:embed="rId9">
+                    <a:blip r:embed="rId10">
                       <a:extLst>
                         <a:ext uri="{28A0092B-C50C-407E-A947-70E740481C1C}">
                           <a14:useLocalDpi xmlns:a14="http://schemas.microsoft.com/office/drawing/2010/main" val="0"/>
@@ -2196,6 +2212,7 @@
   <w:style w:type="character" w:default="1" w:styleId="Phngmcinhcuaoanvn">
     <w:name w:val="Default Paragraph Font"/>
     <w:uiPriority w:val="1"/>
+    <w:semiHidden/>
     <w:unhideWhenUsed/>
   </w:style>
   <w:style w:type="table" w:default="1" w:styleId="BangThngthng">

</xml_diff>

<commit_message>
Update task assignment file references to match current file structure
</commit_message>
<xml_diff>
--- a/docs/Task Assignment & Tool Usage Evidence.docx
+++ b/docs/Task Assignment & Tool Usage Evidence.docx
@@ -456,7 +456,7 @@
               <w:rPr>
                 <w:rFonts w:ascii="Calibri" w:eastAsia="Calibri" w:hAnsi="Calibri" w:cs="Calibri"/>
               </w:rPr>
-              <w:t>member_ops.py, test_member_ops.py</w:t>
+              <w:t>models.py (Member class), test_member.py</w:t>
             </w:r>
           </w:p>
         </w:tc>
@@ -545,7 +545,7 @@
               <w:rPr>
                 <w:rFonts w:ascii="Calibri" w:eastAsia="Calibri" w:hAnsi="Calibri" w:cs="Calibri"/>
               </w:rPr>
-              <w:t>admin_ops.py, fines.py</w:t>
+              <w:t>models.py (Administrator, Book, BorrowRecord, Fine classes)</w:t>
             </w:r>
           </w:p>
         </w:tc>
@@ -634,7 +634,7 @@
               <w:rPr>
                 <w:rFonts w:ascii="Calibri" w:eastAsia="Calibri" w:hAnsi="Calibri" w:cs="Calibri"/>
               </w:rPr>
-              <w:t>test_admin_ops.py, Testing Document.xlsx, Test_Report.md, Dockerfile</w:t>
+              <w:t>test_admin.py, Testing Document.xlsx, Test_Report.md, Dockerfile</w:t>
             </w:r>
           </w:p>
         </w:tc>

</xml_diff>